<commit_message>
Fix appendix heading formatting
This commit removes the italic emphasis from the algorithm section headings in APPENDIX.md and refreshes the corresponding APPENDIX.docx so the document formatting stays consistent with the source text.
</commit_message>
<xml_diff>
--- a/APPENDIX.docx
+++ b/APPENDIX.docx
@@ -8532,8 +8532,7 @@
     </w:p>
     <w:p>
       <w:pPr>
-        <w:pStyle w:val="FigureCaption"/>
-        <w:keepNext w:val="0"/>
+        <w:pStyle w:val="AlgorithmCaption"/>
       </w:pPr>
       <w:r>
         <w:t xml:space="preserve">ALGORITHM 1: The rewrite instructions behind the four query registers</w:t>
@@ -8541,7 +8540,7 @@
     </w:p>
     <w:p>
       <w:pPr>
-        <w:pStyle w:val="Para"/>
+        <w:pStyle w:val="Algorithm"/>
       </w:pPr>
       <w:r>
         <w:t xml:space="preserve">user message  —  "Game: {title}" then the article text</w:t>
@@ -8583,8 +8582,7 @@
     </w:p>
     <w:p>
       <w:pPr>
-        <w:pStyle w:val="FigureCaption"/>
-        <w:keepNext w:val="0"/>
+        <w:pStyle w:val="AlgorithmCaption"/>
       </w:pPr>
       <w:r>
         <w:t xml:space="preserve">ALGORITHM 2: The 23 TAG classes, each written as the original Steam tags it absorbs</w:t>
@@ -8592,7 +8590,7 @@
     </w:p>
     <w:p>
       <w:pPr>
-        <w:pStyle w:val="Para"/>
+        <w:pStyle w:val="Algorithm"/>
       </w:pPr>
       <w:r>
         <w:t xml:space="preserve">Action/Adventure = [Action, Action-Adventure, Adventure, Combat, Hack and Slash, Souls-like]</w:t>

</xml_diff>